<commit_message>
Fix heatmap gridline bleed and add template usage quickstart
- notebooks/notebook-01.qmd: flip global axes.grid default to False; opt-in
  explicitly with ax.grid(axis="y", ...) on the boxplot. The implicit
  y-axis grid was bleeding horizontal white lines through fig-correlation's
  diagonal cells.
- README.md: add a "Using This Template" section between Quick Start and
  How It Works — a 10-step ordered checklist for new adopters
  (toolchain, kernels, check-env, first render, fill metadata, swap data,
  notebooks, clear handoffs, populate references.bib).
- handoffs/20260415_2300.md: session handoff documenting the bug fix,
  template intent confirmation, and prioritized P1/P3/P5 follow-ups.
- Re-rendered manuscript and notebook previews. R regression SEs in
  tbl-r-regression.* shifted slightly (coefficients unchanged); incidental
  to the R kernel re-running, not from this change.

Co-Authored-By: Claude Opus 4.6 (1M context) <noreply@anthropic.com>
</commit_message>
<xml_diff>
--- a/_manuscript/index.docx
+++ b/_manuscript/index.docx
@@ -3271,7 +3271,7 @@
               <w:jc w:val="center"/>
             </w:pPr>
             <w:r>
-              <w:t xml:space="preserve">(0.088)</w:t>
+              <w:t xml:space="preserve">(0.108)</w:t>
             </w:r>
           </w:p>
         </w:tc>
@@ -3295,7 +3295,7 @@
               <w:jc w:val="center"/>
             </w:pPr>
             <w:r>
-              <w:t xml:space="preserve">(0.084)</w:t>
+              <w:t xml:space="preserve">(0.103)</w:t>
             </w:r>
           </w:p>
         </w:tc>
@@ -3391,7 +3391,7 @@
               <w:jc w:val="center"/>
             </w:pPr>
             <w:r>
-              <w:t xml:space="preserve">(0.027)</w:t>
+              <w:t xml:space="preserve">(0.025)</w:t>
             </w:r>
           </w:p>
         </w:tc>
@@ -3511,7 +3511,7 @@
               <w:jc w:val="center"/>
             </w:pPr>
             <w:r>
-              <w:t xml:space="preserve">(0.037)</w:t>
+              <w:t xml:space="preserve">(0.040)</w:t>
             </w:r>
           </w:p>
         </w:tc>
@@ -3535,7 +3535,7 @@
               <w:jc w:val="center"/>
             </w:pPr>
             <w:r>
-              <w:t xml:space="preserve">(0.036)</w:t>
+              <w:t xml:space="preserve">(0.038)</w:t>
             </w:r>
           </w:p>
         </w:tc>
@@ -3631,18 +3631,6 @@
               <w:jc w:val="center"/>
             </w:pPr>
             <w:r>
-              <w:t xml:space="preserve">(0.168)</w:t>
-            </w:r>
-          </w:p>
-        </w:tc>
-        <w:tc>
-          <w:tcPr/>
-          <w:p>
-            <w:pPr>
-              <w:pStyle w:val="Compact"/>
-              <w:jc w:val="center"/>
-            </w:pPr>
-            <w:r>
               <w:t xml:space="preserve">(0.159)</w:t>
             </w:r>
           </w:p>
@@ -3655,7 +3643,19 @@
               <w:jc w:val="center"/>
             </w:pPr>
             <w:r>
-              <w:t xml:space="preserve">(0.152)</w:t>
+              <w:t xml:space="preserve">(0.159)</w:t>
+            </w:r>
+          </w:p>
+        </w:tc>
+        <w:tc>
+          <w:tcPr/>
+          <w:p>
+            <w:pPr>
+              <w:pStyle w:val="Compact"/>
+              <w:jc w:val="center"/>
+            </w:pPr>
+            <w:r>
+              <w:t xml:space="preserve">(0.151)</w:t>
             </w:r>
           </w:p>
         </w:tc>
@@ -3693,7 +3693,7 @@
               <w:jc w:val="center"/>
             </w:pPr>
             <w:r>
-              <w:t xml:space="preserve">0.014*</w:t>
+              <w:t xml:space="preserve">0.014**</w:t>
             </w:r>
           </w:p>
         </w:tc>
@@ -3717,7 +3717,7 @@
               <w:jc w:val="center"/>
             </w:pPr>
             <w:r>
-              <w:t xml:space="preserve">0.017**</w:t>
+              <w:t xml:space="preserve">0.017***</w:t>
             </w:r>
           </w:p>
         </w:tc>
@@ -3751,6 +3751,18 @@
               <w:jc w:val="center"/>
             </w:pPr>
             <w:r>
+              <w:t xml:space="preserve">(0.006)</w:t>
+            </w:r>
+          </w:p>
+        </w:tc>
+        <w:tc>
+          <w:tcPr/>
+          <w:p>
+            <w:pPr>
+              <w:pStyle w:val="Compact"/>
+              <w:jc w:val="center"/>
+            </w:pPr>
+            <w:r>
               <w:t xml:space="preserve">(0.008)</w:t>
             </w:r>
           </w:p>
@@ -3763,19 +3775,7 @@
               <w:jc w:val="center"/>
             </w:pPr>
             <w:r>
-              <w:t xml:space="preserve">(0.008)</w:t>
-            </w:r>
-          </w:p>
-        </w:tc>
-        <w:tc>
-          <w:tcPr/>
-          <w:p>
-            <w:pPr>
-              <w:pStyle w:val="Compact"/>
-              <w:jc w:val="center"/>
-            </w:pPr>
-            <w:r>
-              <w:t xml:space="preserve">(0.008)</w:t>
+              <w:t xml:space="preserve">(0.006)</w:t>
             </w:r>
           </w:p>
         </w:tc>

</xml_diff>

<commit_message>
Raise inline figure DPI so heatmap text doesn't alias into visible lines
The manuscript's embedded fig-correlation still showed horizontal white lines
after the ax.grid(False) fix, even though the 300 DPI savefig (images/) was
clean. Root cause: Quarto embeds the plt.show() output, which matplotlib's
inline backend captures at the default ~100 DPI. At that resolution, the
white "1.00" annotation text on dark-red diagonal cells anti-aliases into a
visible horizontal halo that reads as a line. Savefig at 300 DPI doesn't
exhibit the artifact.

Fix: set plt.rcParams["figure.dpi"] = 150, which only affects inline/embedded
capture (savefig respects its own dpi kwarg). Also added
ax.collections[0].set_edgecolor("face") on the heatmap as defense-in-depth
against pcolormesh AA gaps between cells.

Co-Authored-By: Claude Opus 4.6 (1M context) <noreply@anthropic.com>
</commit_message>
<xml_diff>
--- a/_manuscript/index.docx
+++ b/_manuscript/index.docx
@@ -39,7 +39,7 @@
         <w:pStyle w:val="Date"/>
       </w:pPr>
       <w:r>
-        <w:t xml:space="preserve">2026-04-15</w:t>
+        <w:t xml:space="preserve">2026-04-16</w:t>
       </w:r>
     </w:p>
     <w:p>
@@ -283,7 +283,7 @@
             <w:r>
               <w:drawing>
                 <wp:inline>
-                  <wp:extent cx="5334000" cy="3524586"/>
+                  <wp:extent cx="5334000" cy="3535920"/>
                   <wp:effectExtent b="0" l="0" r="0" t="0"/>
                   <wp:docPr descr="" title="" id="14" name="Picture"/>
                   <a:graphic>
@@ -304,7 +304,7 @@
                         <pic:spPr bwMode="auto">
                           <a:xfrm>
                             <a:off x="0" y="0"/>
-                            <a:ext cx="5334000" cy="3524586"/>
+                            <a:ext cx="5334000" cy="3535920"/>
                           </a:xfrm>
                           <a:prstGeom prst="rect">
                             <a:avLst/>
@@ -370,7 +370,7 @@
             <w:r>
               <w:drawing>
                 <wp:inline>
-                  <wp:extent cx="5334000" cy="3524586"/>
+                  <wp:extent cx="5334000" cy="3535920"/>
                   <wp:effectExtent b="0" l="0" r="0" t="0"/>
                   <wp:docPr descr="" title="" id="18" name="Picture"/>
                   <a:graphic>
@@ -391,7 +391,7 @@
                         <pic:spPr bwMode="auto">
                           <a:xfrm>
                             <a:off x="0" y="0"/>
-                            <a:ext cx="5334000" cy="3524586"/>
+                            <a:ext cx="5334000" cy="3535920"/>
                           </a:xfrm>
                           <a:prstGeom prst="rect">
                             <a:avLst/>
@@ -457,7 +457,7 @@
             <w:r>
               <w:drawing>
                 <wp:inline>
-                  <wp:extent cx="4557637" cy="3576213"/>
+                  <wp:extent cx="4556709" cy="3578086"/>
                   <wp:effectExtent b="0" l="0" r="0" t="0"/>
                   <wp:docPr descr="" title="" id="22" name="Picture"/>
                   <a:graphic>
@@ -478,7 +478,7 @@
                         <pic:spPr bwMode="auto">
                           <a:xfrm>
                             <a:off x="0" y="0"/>
-                            <a:ext cx="4557637" cy="3576213"/>
+                            <a:ext cx="4556709" cy="3578086"/>
                           </a:xfrm>
                           <a:prstGeom prst="rect">
                             <a:avLst/>

</xml_diff>